<commit_message>
Update agent names to full legal names
Primary agent: Diego Molina Pasquel Lajous
Successor agent: Martha Patricia Gomez Straffon

Co-Authored-By: Claude Sonnet 5 <noreply@anthropic.com>
Claude-Session: https://claude.ai/code/session_01FsrjBvUM2rTQW4WfooX7AL
</commit_message>
<xml_diff>
--- a/projects/adrian-molina-medical-poa/Adrian_Molina_Illinois_Medical_POA.docx
+++ b/projects/adrian-molina-medical-poa/Adrian_Molina_Illinois_Medical_POA.docx
@@ -132,7 +132,7 @@
           <w:sz w:val="22"/>
           <w:szCs w:val="22"/>
         </w:rPr>
-        <w:t xml:space="preserve">Name: DIEGO MOLINA</w:t>
+        <w:t xml:space="preserve">Name: DIEGO MOLINA PASQUEL LAJOUS</w:t>
       </w:r>
     </w:p>
     <w:p>
@@ -228,7 +228,7 @@
           <w:sz w:val="22"/>
           <w:szCs w:val="22"/>
         </w:rPr>
-        <w:t xml:space="preserve">Name: PATRICIA GOMEZ STRATHON</w:t>
+        <w:t xml:space="preserve">Name: MARTHA PATRICIA GOMEZ STRAFFON</w:t>
       </w:r>
     </w:p>
     <w:p>
@@ -786,7 +786,7 @@
           <w:sz w:val="22"/>
           <w:szCs w:val="22"/>
         </w:rPr>
-        <w:t xml:space="preserve">Primary Agent Signature (Diego Molina): ___________________________________   Date: ____________________</w:t>
+        <w:t xml:space="preserve">Primary Agent Signature (Diego Molina Pasquel Lajous): ___________________________________   Date: ____________________</w:t>
       </w:r>
     </w:p>
     <w:p>
@@ -799,7 +799,7 @@
           <w:sz w:val="22"/>
           <w:szCs w:val="22"/>
         </w:rPr>
-        <w:t xml:space="preserve">Successor Agent Signature (Patricia Gomez Strathon): ____________________   Date: ____________________</w:t>
+        <w:t xml:space="preserve">Successor Agent Signature (Martha Patricia Gomez Straffon): ____________________   Date: ____________________</w:t>
       </w:r>
     </w:p>
     <w:p>

</xml_diff>